<commit_message>
Adding the resume in the assests and connecting it with the page
</commit_message>
<xml_diff>
--- a/assets/Vikash_Kumar_CV.docx
+++ b/assets/Vikash_Kumar_CV.docx
@@ -66,7 +66,7 @@
         </w:rPr>
         <w:t xml:space="preserve">   |   </w:t>
       </w:r>
-      <w:hyperlink w:history="1" r:id="rIdaderilswdhnxgol1rxlco">
+      <w:hyperlink w:history="1" r:id="rIdywxluqh0elqmudptlmmcq">
         <w:r>
           <w:rPr>
             <w:rFonts w:ascii="Calibri" w:cs="Calibri" w:eastAsia="Calibri" w:hAnsi="Calibri"/>
@@ -82,7 +82,7 @@
       <w:pPr>
         <w:spacing w:after="0"/>
       </w:pPr>
-      <w:hyperlink w:history="1" r:id="rIdlvutjrthdezsvtehipu8k">
+      <w:hyperlink w:history="1" r:id="rIdff4skoeppu_cyjylgve0f">
         <w:r>
           <w:rPr>
             <w:rFonts w:ascii="Calibri" w:cs="Calibri" w:eastAsia="Calibri" w:hAnsi="Calibri"/>
@@ -90,7 +90,7 @@
             <w:sz w:val="18"/>
             <w:szCs w:val="18"/>
           </w:rPr>
-          <w:t xml:space="preserve">vikashkumar.vercel.app</w:t>
+          <w:t xml:space="preserve">portfolio-karthik-vikash.vercel.app</w:t>
         </w:r>
       </w:hyperlink>
       <w:r>
@@ -102,7 +102,7 @@
         </w:rPr>
         <w:t xml:space="preserve">   |   </w:t>
       </w:r>
-      <w:hyperlink w:history="1" r:id="rIdi5j4lspl6fawhszr1wfmd">
+      <w:hyperlink w:history="1" r:id="rIdhfofgjhmmzv-rzfggarcu">
         <w:r>
           <w:rPr>
             <w:rFonts w:ascii="Calibri" w:cs="Calibri" w:eastAsia="Calibri" w:hAnsi="Calibri"/>
@@ -122,7 +122,7 @@
         </w:rPr>
         <w:t xml:space="preserve">   |   </w:t>
       </w:r>
-      <w:hyperlink w:history="1" r:id="rIdbqqfxqkid6r2nulpqzyqg">
+      <w:hyperlink w:history="1" r:id="rIdl-ugbbnaarilmvcgyy80r">
         <w:r>
           <w:rPr>
             <w:rFonts w:ascii="Calibri" w:cs="Calibri" w:eastAsia="Calibri" w:hAnsi="Calibri"/>
@@ -625,7 +625,7 @@
         </w:rPr>
         <w:t xml:space="preserve">Verma Enterprises — Business Website  </w:t>
       </w:r>
-      <w:hyperlink w:history="1" r:id="rIdxce9f27ucobum0t5wlgiv">
+      <w:hyperlink w:history="1" r:id="rIdfihlxscl00vrmaq4zsxkt">
         <w:r>
           <w:rPr>
             <w:rFonts w:ascii="Calibri" w:cs="Calibri" w:eastAsia="Calibri" w:hAnsi="Calibri"/>
@@ -682,7 +682,7 @@
         </w:rPr>
         <w:t xml:space="preserve">Calculator App  </w:t>
       </w:r>
-      <w:hyperlink w:history="1" r:id="rId2sx39rgbivigqi7qln-y4">
+      <w:hyperlink w:history="1" r:id="rIdohfedh5znlo_m5n5qejps">
         <w:r>
           <w:rPr>
             <w:rFonts w:ascii="Calibri" w:cs="Calibri" w:eastAsia="Calibri" w:hAnsi="Calibri"/>
@@ -739,7 +739,7 @@
         </w:rPr>
         <w:t xml:space="preserve">Digital Clock  </w:t>
       </w:r>
-      <w:hyperlink w:history="1" r:id="rIdanw7ifrv8tolnexyibyt2">
+      <w:hyperlink w:history="1" r:id="rId1autfqexzqh3tt1mpp97x">
         <w:r>
           <w:rPr>
             <w:rFonts w:ascii="Calibri" w:cs="Calibri" w:eastAsia="Calibri" w:hAnsi="Calibri"/>

</xml_diff>